<commit_message>
test(docx): expect merged cells and nested tables as Markdown tables
mammoth emits colspan, rowspan and a table inside a cell, which came out as raw HTML. The fixture script now also builds merged.docx and nested.docx; red first.
</commit_message>
<xml_diff>
--- a/specs/docx/simple.docx
+++ b/specs/docx/simple.docx
@@ -42,6 +42,7 @@
     <w:tbl>
       <w:tr>
         <w:tc>
+          <w:tcPr/>
           <w:p>
             <w:r>
               <w:t>Nome</w:t>
@@ -49,6 +50,7 @@
           </w:p>
         </w:tc>
         <w:tc>
+          <w:tcPr/>
           <w:p>
             <w:r>
               <w:t>Idade</w:t>
@@ -58,6 +60,7 @@
       </w:tr>
       <w:tr>
         <w:tc>
+          <w:tcPr/>
           <w:p>
             <w:r>
               <w:t>Ana</w:t>
@@ -65,6 +68,7 @@
           </w:p>
         </w:tc>
         <w:tc>
+          <w:tcPr/>
           <w:p>
             <w:r>
               <w:t>30</w:t>

</xml_diff>